<commit_message>
feat: add schema in server
</commit_message>
<xml_diff>
--- a/guiaDoc/gia.docx
+++ b/guiaDoc/gia.docx
@@ -584,6 +584,7 @@
         <w:keepLines w:val="0"/>
         <w:widowControl/>
         <w:numPr>
+          <w:ilvl w:val="0"/>
           <w:numId w:val="0"/>
         </w:numPr>
         <w:suppressLineNumbers w:val="0"/>
@@ -599,6 +600,7 @@
         <w:keepLines w:val="0"/>
         <w:widowControl/>
         <w:numPr>
+          <w:ilvl w:val="0"/>
           <w:numId w:val="0"/>
         </w:numPr>
         <w:suppressLineNumbers w:val="0"/>
@@ -1075,10 +1077,7 @@
         <w:ind w:left="1440" w:leftChars="0" w:hanging="360"/>
       </w:pPr>
       <w:r>
-        <w:t>initialize</w:t>
-      </w:r>
-      <w:r>
-        <w:t xml:space="preserve"> </w:t>
+        <w:t xml:space="preserve">initialize </w:t>
       </w:r>
     </w:p>
     <w:p>
@@ -1095,10 +1094,7 @@
         <w:ind w:left="1440" w:leftChars="0" w:hanging="360"/>
       </w:pPr>
       <w:r>
-        <w:t>tools/list</w:t>
-      </w:r>
-      <w:r>
-        <w:t xml:space="preserve"> </w:t>
+        <w:t xml:space="preserve">tools/list </w:t>
       </w:r>
     </w:p>
     <w:p>
@@ -1637,6 +1633,7 @@
         <w:keepLines w:val="0"/>
         <w:widowControl/>
         <w:numPr>
+          <w:ilvl w:val="0"/>
           <w:numId w:val="0"/>
         </w:numPr>
         <w:suppressLineNumbers w:val="0"/>
@@ -1777,6 +1774,7 @@
         <w:keepLines w:val="0"/>
         <w:widowControl/>
         <w:numPr>
+          <w:ilvl w:val="0"/>
           <w:numId w:val="0"/>
         </w:numPr>
         <w:suppressLineNumbers w:val="0"/>
@@ -1790,6 +1788,7 @@
         <w:keepLines w:val="0"/>
         <w:widowControl/>
         <w:numPr>
+          <w:ilvl w:val="0"/>
           <w:numId w:val="0"/>
         </w:numPr>
         <w:suppressLineNumbers w:val="0"/>
@@ -2328,6 +2327,373 @@
     </w:p>
     <w:p>
       <w:pPr>
+        <w:numPr>
+          <w:ilvl w:val="0"/>
+          <w:numId w:val="3"/>
+        </w:numPr>
+        <w:tabs>
+          <w:tab w:val="clear" w:pos="425"/>
+        </w:tabs>
+        <w:ind w:left="720" w:leftChars="0" w:hanging="360" w:firstLineChars="0"/>
+        <w:jc w:val="left"/>
+        <w:rPr>
+          <w:rFonts w:hint="default" w:ascii="Times New Roman" w:hAnsi="Times New Roman" w:eastAsia="SimSun" w:cs="Times New Roman"/>
+          <w:b/>
+          <w:bCs/>
+          <w:kern w:val="0"/>
+          <w:sz w:val="24"/>
+          <w:szCs w:val="24"/>
+          <w:lang w:val="en-US" w:eastAsia="zh-CN" w:bidi="ar"/>
+        </w:rPr>
+      </w:pPr>
+      <w:r>
+        <w:rPr>
+          <w:rFonts w:ascii="Times New Roman" w:hAnsi="Times New Roman" w:eastAsia="SimSun" w:cs="Times New Roman"/>
+          <w:b/>
+          <w:bCs/>
+          <w:kern w:val="0"/>
+          <w:sz w:val="24"/>
+          <w:szCs w:val="24"/>
+          <w:lang w:val="en-US" w:eastAsia="zh-CN" w:bidi="ar"/>
+        </w:rPr>
+        <w:t>Integraciones reales</w:t>
+      </w:r>
+      <w:bookmarkStart w:id="0" w:name="_GoBack"/>
+      <w:bookmarkEnd w:id="0"/>
+    </w:p>
+    <w:p>
+      <w:pPr>
+        <w:pStyle w:val="3"/>
+        <w:keepNext w:val="0"/>
+        <w:keepLines w:val="0"/>
+        <w:widowControl/>
+        <w:suppressLineNumbers w:val="0"/>
+        <w:ind w:left="720" w:leftChars="0"/>
+      </w:pPr>
+      <w:r>
+        <w:t>APIs</w:t>
+      </w:r>
+    </w:p>
+    <w:p>
+      <w:pPr>
+        <w:keepNext w:val="0"/>
+        <w:keepLines w:val="0"/>
+        <w:widowControl/>
+        <w:numPr>
+          <w:ilvl w:val="0"/>
+          <w:numId w:val="14"/>
+        </w:numPr>
+        <w:suppressLineNumbers w:val="0"/>
+        <w:spacing w:before="0" w:beforeAutospacing="1" w:after="0" w:afterAutospacing="1"/>
+        <w:ind w:left="1560" w:leftChars="0" w:hanging="360"/>
+      </w:pPr>
+      <w:r>
+        <w:t xml:space="preserve">REST </w:t>
+      </w:r>
+    </w:p>
+    <w:p>
+      <w:pPr>
+        <w:keepNext w:val="0"/>
+        <w:keepLines w:val="0"/>
+        <w:widowControl/>
+        <w:numPr>
+          <w:ilvl w:val="0"/>
+          <w:numId w:val="14"/>
+        </w:numPr>
+        <w:suppressLineNumbers w:val="0"/>
+        <w:spacing w:before="0" w:beforeAutospacing="1" w:after="0" w:afterAutospacing="1"/>
+        <w:ind w:left="1560" w:leftChars="0" w:hanging="360"/>
+      </w:pPr>
+      <w:r>
+        <w:t xml:space="preserve">GraphQL </w:t>
+      </w:r>
+    </w:p>
+    <w:p>
+      <w:pPr>
+        <w:pStyle w:val="3"/>
+        <w:keepNext w:val="0"/>
+        <w:keepLines w:val="0"/>
+        <w:widowControl/>
+        <w:suppressLineNumbers w:val="0"/>
+        <w:ind w:firstLine="720" w:firstLineChars="0"/>
+      </w:pPr>
+    </w:p>
+    <w:p>
+      <w:pPr>
+        <w:pStyle w:val="3"/>
+        <w:keepNext w:val="0"/>
+        <w:keepLines w:val="0"/>
+        <w:widowControl/>
+        <w:suppressLineNumbers w:val="0"/>
+        <w:ind w:firstLine="720" w:firstLineChars="0"/>
+      </w:pPr>
+      <w:r>
+        <w:t>Bases de datos</w:t>
+      </w:r>
+    </w:p>
+    <w:p>
+      <w:pPr>
+        <w:keepNext w:val="0"/>
+        <w:keepLines w:val="0"/>
+        <w:widowControl/>
+        <w:numPr>
+          <w:ilvl w:val="0"/>
+          <w:numId w:val="15"/>
+        </w:numPr>
+        <w:suppressLineNumbers w:val="0"/>
+        <w:tabs>
+          <w:tab w:val="left" w:pos="720"/>
+          <w:tab w:val="clear" w:pos="1140"/>
+        </w:tabs>
+        <w:spacing w:before="0" w:beforeAutospacing="1" w:after="0" w:afterAutospacing="1"/>
+        <w:ind w:left="1140" w:leftChars="0" w:hanging="360"/>
+      </w:pPr>
+      <w:r>
+        <w:t xml:space="preserve">PostgreSQL </w:t>
+      </w:r>
+    </w:p>
+    <w:p>
+      <w:pPr>
+        <w:keepNext w:val="0"/>
+        <w:keepLines w:val="0"/>
+        <w:widowControl/>
+        <w:numPr>
+          <w:ilvl w:val="0"/>
+          <w:numId w:val="15"/>
+        </w:numPr>
+        <w:suppressLineNumbers w:val="0"/>
+        <w:tabs>
+          <w:tab w:val="left" w:pos="720"/>
+          <w:tab w:val="clear" w:pos="1140"/>
+        </w:tabs>
+        <w:spacing w:before="0" w:beforeAutospacing="1" w:after="0" w:afterAutospacing="1"/>
+        <w:ind w:left="1140" w:leftChars="0" w:hanging="360"/>
+      </w:pPr>
+      <w:r>
+        <w:t xml:space="preserve">SQLite </w:t>
+      </w:r>
+    </w:p>
+    <w:p>
+      <w:pPr>
+        <w:keepNext w:val="0"/>
+        <w:keepLines w:val="0"/>
+        <w:widowControl/>
+        <w:numPr>
+          <w:ilvl w:val="0"/>
+          <w:numId w:val="15"/>
+        </w:numPr>
+        <w:suppressLineNumbers w:val="0"/>
+        <w:tabs>
+          <w:tab w:val="left" w:pos="720"/>
+          <w:tab w:val="clear" w:pos="1140"/>
+        </w:tabs>
+        <w:spacing w:before="0" w:beforeAutospacing="1" w:after="0" w:afterAutospacing="1"/>
+        <w:ind w:left="1140" w:leftChars="0" w:hanging="360"/>
+      </w:pPr>
+      <w:r>
+        <w:t xml:space="preserve">Redis </w:t>
+      </w:r>
+    </w:p>
+    <w:p>
+      <w:pPr>
+        <w:pStyle w:val="3"/>
+        <w:keepNext w:val="0"/>
+        <w:keepLines w:val="0"/>
+        <w:widowControl/>
+        <w:suppressLineNumbers w:val="0"/>
+        <w:ind w:left="720" w:leftChars="0"/>
+      </w:pPr>
+      <w:r>
+        <w:t>Sistema</w:t>
+      </w:r>
+    </w:p>
+    <w:p>
+      <w:pPr>
+        <w:keepNext w:val="0"/>
+        <w:keepLines w:val="0"/>
+        <w:widowControl/>
+        <w:numPr>
+          <w:ilvl w:val="0"/>
+          <w:numId w:val="16"/>
+        </w:numPr>
+        <w:suppressLineNumbers w:val="0"/>
+        <w:spacing w:before="0" w:beforeAutospacing="1" w:after="0" w:afterAutospacing="1"/>
+        <w:ind w:left="1440" w:leftChars="0" w:hanging="360"/>
+      </w:pPr>
+      <w:r>
+        <w:t xml:space="preserve">shell </w:t>
+      </w:r>
+    </w:p>
+    <w:p>
+      <w:pPr>
+        <w:keepNext w:val="0"/>
+        <w:keepLines w:val="0"/>
+        <w:widowControl/>
+        <w:numPr>
+          <w:ilvl w:val="0"/>
+          <w:numId w:val="16"/>
+        </w:numPr>
+        <w:suppressLineNumbers w:val="0"/>
+        <w:spacing w:before="0" w:beforeAutospacing="1" w:after="0" w:afterAutospacing="1"/>
+        <w:ind w:left="1440" w:leftChars="0" w:hanging="360"/>
+      </w:pPr>
+      <w:r>
+        <w:t xml:space="preserve">filesystem </w:t>
+      </w:r>
+    </w:p>
+    <w:p>
+      <w:pPr>
+        <w:keepNext w:val="0"/>
+        <w:keepLines w:val="0"/>
+        <w:widowControl/>
+        <w:numPr>
+          <w:ilvl w:val="0"/>
+          <w:numId w:val="16"/>
+        </w:numPr>
+        <w:suppressLineNumbers w:val="0"/>
+        <w:spacing w:before="0" w:beforeAutospacing="1" w:after="0" w:afterAutospacing="1"/>
+        <w:ind w:left="1440" w:leftChars="0" w:hanging="360"/>
+      </w:pPr>
+      <w:r>
+        <w:t xml:space="preserve">docker </w:t>
+      </w:r>
+    </w:p>
+    <w:p>
+      <w:pPr>
+        <w:keepNext w:val="0"/>
+        <w:keepLines w:val="0"/>
+        <w:widowControl/>
+        <w:numPr>
+          <w:ilvl w:val="0"/>
+          <w:numId w:val="16"/>
+        </w:numPr>
+        <w:suppressLineNumbers w:val="0"/>
+        <w:spacing w:before="0" w:beforeAutospacing="1" w:after="0" w:afterAutospacing="1"/>
+        <w:ind w:left="1440" w:leftChars="0" w:hanging="360"/>
+      </w:pPr>
+      <w:r>
+        <w:t xml:space="preserve">git </w:t>
+      </w:r>
+    </w:p>
+    <w:p>
+      <w:pPr>
+        <w:pStyle w:val="3"/>
+        <w:keepNext w:val="0"/>
+        <w:keepLines w:val="0"/>
+        <w:widowControl/>
+        <w:suppressLineNumbers w:val="0"/>
+        <w:ind w:left="720" w:leftChars="0"/>
+        <w:rPr>
+          <w:strike/>
+          <w:dstrike w:val="0"/>
+        </w:rPr>
+      </w:pPr>
+      <w:r>
+        <w:rPr>
+          <w:strike/>
+          <w:dstrike w:val="0"/>
+        </w:rPr>
+        <w:t>IA</w:t>
+      </w:r>
+    </w:p>
+    <w:p>
+      <w:pPr>
+        <w:keepNext w:val="0"/>
+        <w:keepLines w:val="0"/>
+        <w:widowControl/>
+        <w:numPr>
+          <w:ilvl w:val="0"/>
+          <w:numId w:val="17"/>
+        </w:numPr>
+        <w:suppressLineNumbers w:val="0"/>
+        <w:spacing w:before="0" w:beforeAutospacing="1" w:after="0" w:afterAutospacing="1"/>
+        <w:ind w:left="1440" w:leftChars="0" w:hanging="360"/>
+        <w:rPr>
+          <w:strike/>
+          <w:dstrike w:val="0"/>
+        </w:rPr>
+      </w:pPr>
+      <w:r>
+        <w:rPr>
+          <w:strike/>
+          <w:dstrike w:val="0"/>
+        </w:rPr>
+        <w:t xml:space="preserve">embeddings </w:t>
+      </w:r>
+    </w:p>
+    <w:p>
+      <w:pPr>
+        <w:keepNext w:val="0"/>
+        <w:keepLines w:val="0"/>
+        <w:widowControl/>
+        <w:numPr>
+          <w:ilvl w:val="0"/>
+          <w:numId w:val="17"/>
+        </w:numPr>
+        <w:suppressLineNumbers w:val="0"/>
+        <w:spacing w:before="0" w:beforeAutospacing="1" w:after="0" w:afterAutospacing="1"/>
+        <w:ind w:left="1440" w:leftChars="0" w:hanging="360"/>
+        <w:rPr>
+          <w:strike/>
+          <w:dstrike w:val="0"/>
+        </w:rPr>
+      </w:pPr>
+      <w:r>
+        <w:rPr>
+          <w:strike/>
+          <w:dstrike w:val="0"/>
+        </w:rPr>
+        <w:t xml:space="preserve">vector DBs </w:t>
+      </w:r>
+    </w:p>
+    <w:p>
+      <w:pPr>
+        <w:keepNext w:val="0"/>
+        <w:keepLines w:val="0"/>
+        <w:widowControl/>
+        <w:numPr>
+          <w:ilvl w:val="0"/>
+          <w:numId w:val="17"/>
+        </w:numPr>
+        <w:suppressLineNumbers w:val="0"/>
+        <w:spacing w:before="0" w:beforeAutospacing="1" w:after="0" w:afterAutospacing="1"/>
+        <w:ind w:left="1440" w:leftChars="0" w:hanging="360"/>
+        <w:rPr>
+          <w:strike/>
+          <w:dstrike w:val="0"/>
+        </w:rPr>
+      </w:pPr>
+      <w:r>
+        <w:rPr>
+          <w:strike/>
+          <w:dstrike w:val="0"/>
+        </w:rPr>
+        <w:t>reranking</w:t>
+      </w:r>
+    </w:p>
+    <w:p>
+      <w:pPr>
+        <w:keepNext w:val="0"/>
+        <w:keepLines w:val="0"/>
+        <w:widowControl/>
+        <w:numPr>
+          <w:ilvl w:val="0"/>
+          <w:numId w:val="0"/>
+        </w:numPr>
+        <w:suppressLineNumbers w:val="0"/>
+        <w:tabs>
+          <w:tab w:val="left" w:pos="720"/>
+        </w:tabs>
+        <w:spacing w:before="0" w:beforeAutospacing="1" w:after="0" w:afterAutospacing="1"/>
+        <w:ind w:left="780" w:leftChars="0"/>
+        <w:rPr>
+          <w:rFonts w:hint="default"/>
+          <w:lang w:val="en-US"/>
+        </w:rPr>
+      </w:pPr>
+    </w:p>
+    <w:p>
+      <w:pPr>
         <w:keepNext w:val="0"/>
         <w:keepLines w:val="0"/>
         <w:widowControl/>
@@ -2344,7 +2710,7 @@
         <w:ind w:left="720" w:leftChars="0" w:hanging="360" w:firstLineChars="0"/>
         <w:rPr>
           <w:rFonts w:hint="default"/>
-          <w:lang w:val="en-US"/>
+          <w:lang w:val="en-US" w:eastAsia="zh-CN"/>
         </w:rPr>
       </w:pPr>
       <w:r>
@@ -2353,7 +2719,7 @@
           <w:sz w:val="24"/>
           <w:szCs w:val="24"/>
         </w:rPr>
-        <w:t>Integraciones reales</w:t>
+        <w:t>Producción</w:t>
       </w:r>
     </w:p>
     <w:p>
@@ -2363,77 +2729,26 @@
         <w:keepLines w:val="0"/>
         <w:widowControl/>
         <w:suppressLineNumbers w:val="0"/>
-        <w:ind w:left="720" w:leftChars="0"/>
-      </w:pPr>
-      <w:r>
-        <w:t>APIs</w:t>
-      </w:r>
-    </w:p>
-    <w:p>
-      <w:pPr>
-        <w:keepNext w:val="0"/>
-        <w:keepLines w:val="0"/>
-        <w:widowControl/>
-        <w:numPr>
-          <w:ilvl w:val="0"/>
-          <w:numId w:val="14"/>
-        </w:numPr>
-        <w:suppressLineNumbers w:val="0"/>
-        <w:spacing w:before="0" w:beforeAutospacing="1" w:after="0" w:afterAutospacing="1"/>
-        <w:ind w:left="1560" w:leftChars="0" w:hanging="360"/>
-      </w:pPr>
-      <w:r>
-        <w:t xml:space="preserve">REST </w:t>
-      </w:r>
-    </w:p>
-    <w:p>
-      <w:pPr>
-        <w:keepNext w:val="0"/>
-        <w:keepLines w:val="0"/>
-        <w:widowControl/>
-        <w:numPr>
-          <w:ilvl w:val="0"/>
-          <w:numId w:val="14"/>
-        </w:numPr>
-        <w:suppressLineNumbers w:val="0"/>
-        <w:spacing w:before="0" w:beforeAutospacing="1" w:after="0" w:afterAutospacing="1"/>
-        <w:ind w:left="1560" w:leftChars="0" w:hanging="360"/>
-      </w:pPr>
-      <w:r>
-        <w:t xml:space="preserve">GraphQL </w:t>
-      </w:r>
-    </w:p>
-    <w:p>
-      <w:pPr>
-        <w:pStyle w:val="3"/>
-        <w:keepNext w:val="0"/>
-        <w:keepLines w:val="0"/>
-        <w:widowControl/>
-        <w:suppressLineNumbers w:val="0"/>
-        <w:ind w:firstLine="720" w:firstLineChars="0"/>
-      </w:pPr>
-    </w:p>
-    <w:p>
-      <w:pPr>
-        <w:pStyle w:val="3"/>
-        <w:keepNext w:val="0"/>
-        <w:keepLines w:val="0"/>
-        <w:widowControl/>
-        <w:suppressLineNumbers w:val="0"/>
-        <w:ind w:firstLine="720" w:firstLineChars="0"/>
-      </w:pPr>
-      <w:r>
-        <w:t>Bases de datos</w:t>
-      </w:r>
-    </w:p>
-    <w:p>
-      <w:pPr>
-        <w:keepNext w:val="0"/>
-        <w:keepLines w:val="0"/>
-        <w:widowControl/>
-        <w:numPr>
-          <w:ilvl w:val="0"/>
-          <w:numId w:val="15"/>
+      </w:pPr>
+      <w:r>
+        <w:rPr>
+          <w:rFonts w:hint="default"/>
+          <w:lang w:val="en-US" w:eastAsia="zh-CN"/>
+        </w:rPr>
+        <w:tab/>
+      </w:r>
+      <w:r>
+        <w:t>Temas</w:t>
+      </w:r>
+    </w:p>
+    <w:p>
+      <w:pPr>
+        <w:keepNext w:val="0"/>
+        <w:keepLines w:val="0"/>
+        <w:widowControl/>
+        <w:numPr>
+          <w:ilvl w:val="0"/>
+          <w:numId w:val="18"/>
         </w:numPr>
         <w:suppressLineNumbers w:val="0"/>
         <w:tabs>
@@ -2444,17 +2759,17 @@
         <w:ind w:left="1140" w:leftChars="0" w:hanging="360"/>
       </w:pPr>
       <w:r>
-        <w:t xml:space="preserve">PostgreSQL </w:t>
-      </w:r>
-    </w:p>
-    <w:p>
-      <w:pPr>
-        <w:keepNext w:val="0"/>
-        <w:keepLines w:val="0"/>
-        <w:widowControl/>
-        <w:numPr>
-          <w:ilvl w:val="0"/>
-          <w:numId w:val="15"/>
+        <w:t xml:space="preserve">logging </w:t>
+      </w:r>
+    </w:p>
+    <w:p>
+      <w:pPr>
+        <w:keepNext w:val="0"/>
+        <w:keepLines w:val="0"/>
+        <w:widowControl/>
+        <w:numPr>
+          <w:ilvl w:val="0"/>
+          <w:numId w:val="18"/>
         </w:numPr>
         <w:suppressLineNumbers w:val="0"/>
         <w:tabs>
@@ -2465,17 +2780,21 @@
         <w:ind w:left="1140" w:leftChars="0" w:hanging="360"/>
       </w:pPr>
       <w:r>
-        <w:t xml:space="preserve">SQLite </w:t>
-      </w:r>
-    </w:p>
-    <w:p>
-      <w:pPr>
-        <w:keepNext w:val="0"/>
-        <w:keepLines w:val="0"/>
-        <w:widowControl/>
-        <w:numPr>
-          <w:ilvl w:val="0"/>
-          <w:numId w:val="15"/>
+        <w:rPr>
+          <w:strike/>
+          <w:dstrike w:val="0"/>
+        </w:rPr>
+        <w:t xml:space="preserve">tracing </w:t>
+      </w:r>
+    </w:p>
+    <w:p>
+      <w:pPr>
+        <w:keepNext w:val="0"/>
+        <w:keepLines w:val="0"/>
+        <w:widowControl/>
+        <w:numPr>
+          <w:ilvl w:val="0"/>
+          <w:numId w:val="18"/>
         </w:numPr>
         <w:suppressLineNumbers w:val="0"/>
         <w:tabs>
@@ -2486,192 +2805,192 @@
         <w:ind w:left="1140" w:leftChars="0" w:hanging="360"/>
       </w:pPr>
       <w:r>
-        <w:t xml:space="preserve">Redis </w:t>
-      </w:r>
-    </w:p>
-    <w:p>
-      <w:pPr>
-        <w:pStyle w:val="3"/>
-        <w:keepNext w:val="0"/>
-        <w:keepLines w:val="0"/>
-        <w:widowControl/>
-        <w:suppressLineNumbers w:val="0"/>
-        <w:ind w:left="720" w:leftChars="0"/>
-      </w:pPr>
-      <w:r>
-        <w:t>Sistema</w:t>
-      </w:r>
-    </w:p>
-    <w:p>
-      <w:pPr>
-        <w:keepNext w:val="0"/>
-        <w:keepLines w:val="0"/>
-        <w:widowControl/>
-        <w:numPr>
-          <w:ilvl w:val="0"/>
-          <w:numId w:val="16"/>
-        </w:numPr>
-        <w:suppressLineNumbers w:val="0"/>
-        <w:spacing w:before="0" w:beforeAutospacing="1" w:after="0" w:afterAutospacing="1"/>
-        <w:ind w:left="1440" w:leftChars="0" w:hanging="360"/>
-      </w:pPr>
-      <w:r>
-        <w:t xml:space="preserve">shell </w:t>
-      </w:r>
-    </w:p>
-    <w:p>
-      <w:pPr>
-        <w:keepNext w:val="0"/>
-        <w:keepLines w:val="0"/>
-        <w:widowControl/>
-        <w:numPr>
-          <w:ilvl w:val="0"/>
-          <w:numId w:val="16"/>
-        </w:numPr>
-        <w:suppressLineNumbers w:val="0"/>
-        <w:spacing w:before="0" w:beforeAutospacing="1" w:after="0" w:afterAutospacing="1"/>
-        <w:ind w:left="1440" w:leftChars="0" w:hanging="360"/>
-      </w:pPr>
-      <w:r>
-        <w:t xml:space="preserve">filesystem </w:t>
-      </w:r>
-    </w:p>
-    <w:p>
-      <w:pPr>
-        <w:keepNext w:val="0"/>
-        <w:keepLines w:val="0"/>
-        <w:widowControl/>
-        <w:numPr>
-          <w:ilvl w:val="0"/>
-          <w:numId w:val="16"/>
-        </w:numPr>
-        <w:suppressLineNumbers w:val="0"/>
-        <w:spacing w:before="0" w:beforeAutospacing="1" w:after="0" w:afterAutospacing="1"/>
-        <w:ind w:left="1440" w:leftChars="0" w:hanging="360"/>
-      </w:pPr>
-      <w:r>
-        <w:t xml:space="preserve">docker </w:t>
-      </w:r>
-    </w:p>
-    <w:p>
-      <w:pPr>
-        <w:keepNext w:val="0"/>
-        <w:keepLines w:val="0"/>
-        <w:widowControl/>
-        <w:numPr>
-          <w:ilvl w:val="0"/>
-          <w:numId w:val="16"/>
-        </w:numPr>
-        <w:suppressLineNumbers w:val="0"/>
-        <w:spacing w:before="0" w:beforeAutospacing="1" w:after="0" w:afterAutospacing="1"/>
-        <w:ind w:left="1440" w:leftChars="0" w:hanging="360"/>
-      </w:pPr>
-      <w:r>
-        <w:t xml:space="preserve">git </w:t>
-      </w:r>
-    </w:p>
-    <w:p>
-      <w:pPr>
-        <w:pStyle w:val="3"/>
-        <w:keepNext w:val="0"/>
-        <w:keepLines w:val="0"/>
-        <w:widowControl/>
-        <w:suppressLineNumbers w:val="0"/>
-        <w:ind w:left="720" w:leftChars="0"/>
         <w:rPr>
           <w:strike/>
           <w:dstrike w:val="0"/>
         </w:rPr>
+        <w:t xml:space="preserve">metrics </w:t>
+      </w:r>
+    </w:p>
+    <w:p>
+      <w:pPr>
+        <w:keepNext w:val="0"/>
+        <w:keepLines w:val="0"/>
+        <w:widowControl/>
+        <w:numPr>
+          <w:ilvl w:val="0"/>
+          <w:numId w:val="18"/>
+        </w:numPr>
+        <w:suppressLineNumbers w:val="0"/>
+        <w:tabs>
+          <w:tab w:val="left" w:pos="720"/>
+          <w:tab w:val="clear" w:pos="1140"/>
+        </w:tabs>
+        <w:spacing w:before="0" w:beforeAutospacing="1" w:after="0" w:afterAutospacing="1"/>
+        <w:ind w:left="1140" w:leftChars="0" w:hanging="360"/>
+      </w:pPr>
+      <w:r>
+        <w:t xml:space="preserve">auth </w:t>
+      </w:r>
+    </w:p>
+    <w:p>
+      <w:pPr>
+        <w:keepNext w:val="0"/>
+        <w:keepLines w:val="0"/>
+        <w:widowControl/>
+        <w:numPr>
+          <w:ilvl w:val="0"/>
+          <w:numId w:val="18"/>
+        </w:numPr>
+        <w:suppressLineNumbers w:val="0"/>
+        <w:tabs>
+          <w:tab w:val="left" w:pos="720"/>
+          <w:tab w:val="clear" w:pos="1140"/>
+        </w:tabs>
+        <w:spacing w:before="0" w:beforeAutospacing="1" w:after="0" w:afterAutospacing="1"/>
+        <w:ind w:left="1140" w:leftChars="0" w:hanging="360"/>
+      </w:pPr>
+      <w:r>
+        <w:t xml:space="preserve">secrets </w:t>
+      </w:r>
+    </w:p>
+    <w:p>
+      <w:pPr>
+        <w:keepNext w:val="0"/>
+        <w:keepLines w:val="0"/>
+        <w:widowControl/>
+        <w:numPr>
+          <w:ilvl w:val="0"/>
+          <w:numId w:val="18"/>
+        </w:numPr>
+        <w:suppressLineNumbers w:val="0"/>
+        <w:tabs>
+          <w:tab w:val="left" w:pos="720"/>
+          <w:tab w:val="clear" w:pos="1140"/>
+        </w:tabs>
+        <w:spacing w:before="0" w:beforeAutospacing="1" w:after="0" w:afterAutospacing="1"/>
+        <w:ind w:left="1140" w:leftChars="0" w:hanging="360"/>
+      </w:pPr>
+      <w:r>
+        <w:t xml:space="preserve">rate limiting </w:t>
+      </w:r>
+    </w:p>
+    <w:p>
+      <w:pPr>
+        <w:keepNext w:val="0"/>
+        <w:keepLines w:val="0"/>
+        <w:widowControl/>
+        <w:numPr>
+          <w:ilvl w:val="0"/>
+          <w:numId w:val="18"/>
+        </w:numPr>
+        <w:suppressLineNumbers w:val="0"/>
+        <w:tabs>
+          <w:tab w:val="left" w:pos="720"/>
+          <w:tab w:val="clear" w:pos="1140"/>
+        </w:tabs>
+        <w:spacing w:before="0" w:beforeAutospacing="1" w:after="0" w:afterAutospacing="1"/>
+        <w:ind w:left="1140" w:leftChars="0" w:hanging="360"/>
       </w:pPr>
       <w:r>
         <w:rPr>
           <w:strike/>
           <w:dstrike w:val="0"/>
         </w:rPr>
-        <w:t>IA</w:t>
-      </w:r>
-    </w:p>
-    <w:p>
-      <w:pPr>
-        <w:keepNext w:val="0"/>
-        <w:keepLines w:val="0"/>
-        <w:widowControl/>
-        <w:numPr>
-          <w:ilvl w:val="0"/>
-          <w:numId w:val="17"/>
-        </w:numPr>
-        <w:suppressLineNumbers w:val="0"/>
-        <w:spacing w:before="0" w:beforeAutospacing="1" w:after="0" w:afterAutospacing="1"/>
-        <w:ind w:left="1440" w:leftChars="0" w:hanging="360"/>
-        <w:rPr>
-          <w:strike/>
-          <w:dstrike w:val="0"/>
-        </w:rPr>
-      </w:pPr>
-      <w:r>
-        <w:rPr>
-          <w:strike/>
-          <w:dstrike w:val="0"/>
-        </w:rPr>
-        <w:t xml:space="preserve">embeddings </w:t>
-      </w:r>
-    </w:p>
-    <w:p>
-      <w:pPr>
-        <w:keepNext w:val="0"/>
-        <w:keepLines w:val="0"/>
-        <w:widowControl/>
-        <w:numPr>
-          <w:ilvl w:val="0"/>
-          <w:numId w:val="17"/>
-        </w:numPr>
-        <w:suppressLineNumbers w:val="0"/>
-        <w:spacing w:before="0" w:beforeAutospacing="1" w:after="0" w:afterAutospacing="1"/>
-        <w:ind w:left="1440" w:leftChars="0" w:hanging="360"/>
-        <w:rPr>
-          <w:strike/>
-          <w:dstrike w:val="0"/>
-        </w:rPr>
-      </w:pPr>
-      <w:r>
-        <w:rPr>
-          <w:strike/>
-          <w:dstrike w:val="0"/>
-        </w:rPr>
-        <w:t xml:space="preserve">vector DBs </w:t>
-      </w:r>
-    </w:p>
-    <w:p>
-      <w:pPr>
-        <w:keepNext w:val="0"/>
-        <w:keepLines w:val="0"/>
-        <w:widowControl/>
-        <w:numPr>
-          <w:ilvl w:val="0"/>
-          <w:numId w:val="17"/>
-        </w:numPr>
-        <w:suppressLineNumbers w:val="0"/>
-        <w:spacing w:before="0" w:beforeAutospacing="1" w:after="0" w:afterAutospacing="1"/>
-        <w:ind w:left="1440" w:leftChars="0" w:hanging="360"/>
-        <w:rPr>
-          <w:strike/>
-          <w:dstrike w:val="0"/>
-        </w:rPr>
-      </w:pPr>
-      <w:r>
-        <w:rPr>
-          <w:strike/>
-          <w:dstrike w:val="0"/>
-        </w:rPr>
-        <w:t>reranking</w:t>
-      </w:r>
-    </w:p>
-    <w:p>
-      <w:pPr>
-        <w:keepNext w:val="0"/>
-        <w:keepLines w:val="0"/>
-        <w:widowControl/>
-        <w:numPr>
+        <w:t xml:space="preserve">sandboxing </w:t>
+      </w:r>
+    </w:p>
+    <w:p>
+      <w:pPr>
+        <w:keepNext w:val="0"/>
+        <w:keepLines w:val="0"/>
+        <w:widowControl/>
+        <w:numPr>
+          <w:ilvl w:val="0"/>
+          <w:numId w:val="18"/>
+        </w:numPr>
+        <w:suppressLineNumbers w:val="0"/>
+        <w:tabs>
+          <w:tab w:val="left" w:pos="720"/>
+          <w:tab w:val="clear" w:pos="1140"/>
+        </w:tabs>
+        <w:spacing w:before="0" w:beforeAutospacing="1" w:after="0" w:afterAutospacing="1"/>
+        <w:ind w:left="1140" w:leftChars="0" w:hanging="360"/>
+      </w:pPr>
+      <w:r>
+        <w:t xml:space="preserve">permisos </w:t>
+      </w:r>
+    </w:p>
+    <w:p>
+      <w:pPr>
+        <w:keepNext w:val="0"/>
+        <w:keepLines w:val="0"/>
+        <w:widowControl/>
+        <w:numPr>
+          <w:ilvl w:val="0"/>
+          <w:numId w:val="18"/>
+        </w:numPr>
+        <w:suppressLineNumbers w:val="0"/>
+        <w:tabs>
+          <w:tab w:val="left" w:pos="720"/>
+          <w:tab w:val="clear" w:pos="1140"/>
+        </w:tabs>
+        <w:spacing w:before="0" w:beforeAutospacing="1" w:after="0" w:afterAutospacing="1"/>
+        <w:ind w:left="1140" w:leftChars="0" w:hanging="360"/>
+      </w:pPr>
+      <w:r>
+        <w:t xml:space="preserve">Docker </w:t>
+      </w:r>
+    </w:p>
+    <w:p>
+      <w:pPr>
+        <w:keepNext w:val="0"/>
+        <w:keepLines w:val="0"/>
+        <w:widowControl/>
+        <w:numPr>
+          <w:ilvl w:val="0"/>
+          <w:numId w:val="18"/>
+        </w:numPr>
+        <w:suppressLineNumbers w:val="0"/>
+        <w:tabs>
+          <w:tab w:val="left" w:pos="720"/>
+          <w:tab w:val="clear" w:pos="1140"/>
+        </w:tabs>
+        <w:spacing w:before="0" w:beforeAutospacing="1" w:after="0" w:afterAutospacing="1"/>
+        <w:ind w:left="1140" w:leftChars="0" w:hanging="360"/>
+      </w:pPr>
+      <w:r>
+        <w:t xml:space="preserve">testing </w:t>
+      </w:r>
+    </w:p>
+    <w:p>
+      <w:pPr>
+        <w:keepNext w:val="0"/>
+        <w:keepLines w:val="0"/>
+        <w:widowControl/>
+        <w:numPr>
+          <w:ilvl w:val="0"/>
+          <w:numId w:val="18"/>
+        </w:numPr>
+        <w:suppressLineNumbers w:val="0"/>
+        <w:tabs>
+          <w:tab w:val="left" w:pos="720"/>
+          <w:tab w:val="clear" w:pos="1140"/>
+        </w:tabs>
+        <w:spacing w:before="0" w:beforeAutospacing="1" w:after="0" w:afterAutospacing="1"/>
+        <w:ind w:left="1140" w:leftChars="0" w:hanging="360"/>
+      </w:pPr>
+      <w:r>
+        <w:t>packaging</w:t>
+      </w:r>
+    </w:p>
+    <w:p>
+      <w:pPr>
+        <w:keepNext w:val="0"/>
+        <w:keepLines w:val="0"/>
+        <w:widowControl/>
+        <w:numPr>
+          <w:ilvl w:val="0"/>
           <w:numId w:val="0"/>
         </w:numPr>
         <w:suppressLineNumbers w:val="0"/>
@@ -2679,474 +2998,167 @@
           <w:tab w:val="left" w:pos="720"/>
         </w:tabs>
         <w:spacing w:before="0" w:beforeAutospacing="1" w:after="0" w:afterAutospacing="1"/>
-        <w:ind w:left="780" w:leftChars="0"/>
-        <w:rPr>
-          <w:rFonts w:hint="default"/>
-          <w:lang w:val="en-US"/>
-        </w:rPr>
-      </w:pPr>
-    </w:p>
-    <w:p>
-      <w:pPr>
-        <w:keepNext w:val="0"/>
-        <w:keepLines w:val="0"/>
-        <w:widowControl/>
-        <w:numPr>
-          <w:ilvl w:val="0"/>
-          <w:numId w:val="3"/>
-        </w:numPr>
-        <w:suppressLineNumbers w:val="0"/>
-        <w:tabs>
-          <w:tab w:val="left" w:pos="720"/>
-          <w:tab w:val="clear" w:pos="425"/>
-        </w:tabs>
-        <w:spacing w:before="0" w:beforeAutospacing="1" w:after="0" w:afterAutospacing="1"/>
-        <w:ind w:left="720" w:leftChars="0" w:hanging="360" w:firstLineChars="0"/>
+        <w:ind w:left="360" w:leftChars="0"/>
         <w:rPr>
           <w:rFonts w:hint="default"/>
           <w:lang w:val="en-US" w:eastAsia="zh-CN"/>
         </w:rPr>
       </w:pPr>
-      <w:r>
+    </w:p>
+    <w:p>
+      <w:pPr>
+        <w:keepNext w:val="0"/>
+        <w:keepLines w:val="0"/>
+        <w:widowControl/>
+        <w:numPr>
+          <w:ilvl w:val="0"/>
+          <w:numId w:val="0"/>
+        </w:numPr>
+        <w:suppressLineNumbers w:val="0"/>
+        <w:tabs>
+          <w:tab w:val="left" w:pos="720"/>
+        </w:tabs>
+        <w:spacing w:before="0" w:beforeAutospacing="1" w:after="0" w:afterAutospacing="1"/>
+        <w:ind w:left="360" w:leftChars="0"/>
+        <w:rPr>
+          <w:rFonts w:hint="default"/>
+          <w:lang w:val="en-US" w:eastAsia="zh-CN"/>
+        </w:rPr>
+      </w:pPr>
+    </w:p>
+    <w:p>
+      <w:pPr>
+        <w:keepNext w:val="0"/>
+        <w:keepLines w:val="0"/>
+        <w:widowControl/>
+        <w:numPr>
+          <w:ilvl w:val="0"/>
+          <w:numId w:val="0"/>
+        </w:numPr>
+        <w:suppressLineNumbers w:val="0"/>
+        <w:tabs>
+          <w:tab w:val="left" w:pos="720"/>
+        </w:tabs>
+        <w:spacing w:before="0" w:beforeAutospacing="1" w:after="0" w:afterAutospacing="1"/>
+        <w:ind w:left="360" w:leftChars="0"/>
+        <w:rPr>
+          <w:rFonts w:hint="default"/>
+          <w:lang w:val="en-US" w:eastAsia="zh-CN"/>
+        </w:rPr>
+      </w:pPr>
+    </w:p>
+    <w:p>
+      <w:pPr>
+        <w:keepNext w:val="0"/>
+        <w:keepLines w:val="0"/>
+        <w:widowControl/>
+        <w:numPr>
+          <w:ilvl w:val="0"/>
+          <w:numId w:val="0"/>
+        </w:numPr>
+        <w:suppressLineNumbers w:val="0"/>
+        <w:tabs>
+          <w:tab w:val="left" w:pos="720"/>
+        </w:tabs>
+        <w:spacing w:before="0" w:beforeAutospacing="1" w:after="0" w:afterAutospacing="1"/>
+        <w:ind w:left="360" w:leftChars="0"/>
+        <w:rPr>
+          <w:rFonts w:hint="default"/>
+          <w:lang w:val="en-US" w:eastAsia="zh-CN"/>
+        </w:rPr>
+      </w:pPr>
+    </w:p>
+    <w:p>
+      <w:pPr>
+        <w:keepNext w:val="0"/>
+        <w:keepLines w:val="0"/>
+        <w:widowControl/>
+        <w:numPr>
+          <w:ilvl w:val="0"/>
+          <w:numId w:val="0"/>
+        </w:numPr>
+        <w:suppressLineNumbers w:val="0"/>
+        <w:tabs>
+          <w:tab w:val="left" w:pos="720"/>
+        </w:tabs>
+        <w:spacing w:before="0" w:beforeAutospacing="1" w:after="0" w:afterAutospacing="1"/>
+        <w:ind w:left="360" w:leftChars="0"/>
+        <w:rPr>
+          <w:rFonts w:hint="default"/>
+          <w:lang w:val="en-US" w:eastAsia="zh-CN"/>
+        </w:rPr>
+      </w:pPr>
+    </w:p>
+    <w:p>
+      <w:pPr>
+        <w:keepNext w:val="0"/>
+        <w:keepLines w:val="0"/>
+        <w:widowControl/>
+        <w:numPr>
+          <w:ilvl w:val="0"/>
+          <w:numId w:val="0"/>
+        </w:numPr>
+        <w:suppressLineNumbers w:val="0"/>
+        <w:tabs>
+          <w:tab w:val="left" w:pos="720"/>
+        </w:tabs>
+        <w:spacing w:before="0" w:beforeAutospacing="1" w:after="0" w:afterAutospacing="1"/>
+        <w:ind w:left="360" w:leftChars="0"/>
+        <w:rPr>
+          <w:rFonts w:hint="default"/>
+          <w:lang w:val="en-US" w:eastAsia="zh-CN"/>
+        </w:rPr>
+      </w:pPr>
+    </w:p>
+    <w:p>
+      <w:pPr>
+        <w:keepNext w:val="0"/>
+        <w:keepLines w:val="0"/>
+        <w:widowControl/>
+        <w:numPr>
+          <w:ilvl w:val="0"/>
+          <w:numId w:val="0"/>
+        </w:numPr>
+        <w:suppressLineNumbers w:val="0"/>
+        <w:tabs>
+          <w:tab w:val="left" w:pos="720"/>
+        </w:tabs>
+        <w:spacing w:before="0" w:beforeAutospacing="1" w:after="0" w:afterAutospacing="1"/>
+        <w:ind w:left="360" w:leftChars="0"/>
+        <w:rPr>
+          <w:rFonts w:hint="default"/>
+          <w:lang w:val="en-US" w:eastAsia="zh-CN"/>
+        </w:rPr>
+      </w:pPr>
+    </w:p>
+    <w:p>
+      <w:pPr>
+        <w:keepNext w:val="0"/>
+        <w:keepLines w:val="0"/>
+        <w:widowControl/>
+        <w:numPr>
+          <w:ilvl w:val="0"/>
+          <w:numId w:val="0"/>
+        </w:numPr>
+        <w:suppressLineNumbers w:val="0"/>
+        <w:tabs>
+          <w:tab w:val="left" w:pos="720"/>
+        </w:tabs>
+        <w:spacing w:before="0" w:beforeAutospacing="1" w:after="0" w:afterAutospacing="1"/>
+        <w:ind w:left="360" w:leftChars="0"/>
+        <w:jc w:val="center"/>
         <w:rPr>
           <w:rFonts w:ascii="SimSun" w:hAnsi="SimSun" w:eastAsia="SimSun" w:cs="SimSun"/>
           <w:sz w:val="24"/>
           <w:szCs w:val="24"/>
         </w:rPr>
-        <w:t>Producción</w:t>
-      </w:r>
-    </w:p>
-    <w:p>
-      <w:pPr>
-        <w:pStyle w:val="3"/>
-        <w:keepNext w:val="0"/>
-        <w:keepLines w:val="0"/>
-        <w:widowControl/>
-        <w:suppressLineNumbers w:val="0"/>
-      </w:pPr>
-      <w:r>
-        <w:rPr>
-          <w:rFonts w:hint="default"/>
-          <w:lang w:val="en-US" w:eastAsia="zh-CN"/>
-        </w:rPr>
-        <w:tab/>
-      </w:r>
-      <w:r>
-        <w:t>Temas</w:t>
-      </w:r>
-    </w:p>
-    <w:p>
-      <w:pPr>
-        <w:keepNext w:val="0"/>
-        <w:keepLines w:val="0"/>
-        <w:widowControl/>
-        <w:numPr>
-          <w:ilvl w:val="0"/>
-          <w:numId w:val="18"/>
-        </w:numPr>
-        <w:suppressLineNumbers w:val="0"/>
-        <w:tabs>
-          <w:tab w:val="left" w:pos="720"/>
-          <w:tab w:val="clear" w:pos="1140"/>
-        </w:tabs>
-        <w:spacing w:before="0" w:beforeAutospacing="1" w:after="0" w:afterAutospacing="1"/>
-        <w:ind w:left="1140" w:leftChars="0" w:hanging="360"/>
-      </w:pPr>
-      <w:r>
-        <w:t xml:space="preserve">logging </w:t>
-      </w:r>
-    </w:p>
-    <w:p>
-      <w:pPr>
-        <w:keepNext w:val="0"/>
-        <w:keepLines w:val="0"/>
-        <w:widowControl/>
-        <w:numPr>
-          <w:ilvl w:val="0"/>
-          <w:numId w:val="18"/>
-        </w:numPr>
-        <w:suppressLineNumbers w:val="0"/>
-        <w:tabs>
-          <w:tab w:val="left" w:pos="720"/>
-          <w:tab w:val="clear" w:pos="1140"/>
-        </w:tabs>
-        <w:spacing w:before="0" w:beforeAutospacing="1" w:after="0" w:afterAutospacing="1"/>
-        <w:ind w:left="1140" w:leftChars="0" w:hanging="360"/>
-      </w:pPr>
-      <w:r>
-        <w:rPr>
-          <w:strike/>
-          <w:dstrike w:val="0"/>
-        </w:rPr>
-        <w:t xml:space="preserve">tracing </w:t>
-      </w:r>
-    </w:p>
-    <w:p>
-      <w:pPr>
-        <w:keepNext w:val="0"/>
-        <w:keepLines w:val="0"/>
-        <w:widowControl/>
-        <w:numPr>
-          <w:ilvl w:val="0"/>
-          <w:numId w:val="18"/>
-        </w:numPr>
-        <w:suppressLineNumbers w:val="0"/>
-        <w:tabs>
-          <w:tab w:val="left" w:pos="720"/>
-          <w:tab w:val="clear" w:pos="1140"/>
-        </w:tabs>
-        <w:spacing w:before="0" w:beforeAutospacing="1" w:after="0" w:afterAutospacing="1"/>
-        <w:ind w:left="1140" w:leftChars="0" w:hanging="360"/>
-      </w:pPr>
-      <w:r>
-        <w:rPr>
-          <w:strike/>
-          <w:dstrike w:val="0"/>
-        </w:rPr>
-        <w:t xml:space="preserve">metrics </w:t>
-      </w:r>
-    </w:p>
-    <w:p>
-      <w:pPr>
-        <w:keepNext w:val="0"/>
-        <w:keepLines w:val="0"/>
-        <w:widowControl/>
-        <w:numPr>
-          <w:ilvl w:val="0"/>
-          <w:numId w:val="18"/>
-        </w:numPr>
-        <w:suppressLineNumbers w:val="0"/>
-        <w:tabs>
-          <w:tab w:val="left" w:pos="720"/>
-          <w:tab w:val="clear" w:pos="1140"/>
-        </w:tabs>
-        <w:spacing w:before="0" w:beforeAutospacing="1" w:after="0" w:afterAutospacing="1"/>
-        <w:ind w:left="1140" w:leftChars="0" w:hanging="360"/>
-      </w:pPr>
-      <w:r>
-        <w:t xml:space="preserve">auth </w:t>
-      </w:r>
-    </w:p>
-    <w:p>
-      <w:pPr>
-        <w:keepNext w:val="0"/>
-        <w:keepLines w:val="0"/>
-        <w:widowControl/>
-        <w:numPr>
-          <w:ilvl w:val="0"/>
-          <w:numId w:val="18"/>
-        </w:numPr>
-        <w:suppressLineNumbers w:val="0"/>
-        <w:tabs>
-          <w:tab w:val="left" w:pos="720"/>
-          <w:tab w:val="clear" w:pos="1140"/>
-        </w:tabs>
-        <w:spacing w:before="0" w:beforeAutospacing="1" w:after="0" w:afterAutospacing="1"/>
-        <w:ind w:left="1140" w:leftChars="0" w:hanging="360"/>
-      </w:pPr>
-      <w:r>
-        <w:t xml:space="preserve">secrets </w:t>
-      </w:r>
-    </w:p>
-    <w:p>
-      <w:pPr>
-        <w:keepNext w:val="0"/>
-        <w:keepLines w:val="0"/>
-        <w:widowControl/>
-        <w:numPr>
-          <w:ilvl w:val="0"/>
-          <w:numId w:val="18"/>
-        </w:numPr>
-        <w:suppressLineNumbers w:val="0"/>
-        <w:tabs>
-          <w:tab w:val="left" w:pos="720"/>
-          <w:tab w:val="clear" w:pos="1140"/>
-        </w:tabs>
-        <w:spacing w:before="0" w:beforeAutospacing="1" w:after="0" w:afterAutospacing="1"/>
-        <w:ind w:left="1140" w:leftChars="0" w:hanging="360"/>
-      </w:pPr>
-      <w:r>
-        <w:t xml:space="preserve">rate limiting </w:t>
-      </w:r>
-    </w:p>
-    <w:p>
-      <w:pPr>
-        <w:keepNext w:val="0"/>
-        <w:keepLines w:val="0"/>
-        <w:widowControl/>
-        <w:numPr>
-          <w:ilvl w:val="0"/>
-          <w:numId w:val="18"/>
-        </w:numPr>
-        <w:suppressLineNumbers w:val="0"/>
-        <w:tabs>
-          <w:tab w:val="left" w:pos="720"/>
-          <w:tab w:val="clear" w:pos="1140"/>
-        </w:tabs>
-        <w:spacing w:before="0" w:beforeAutospacing="1" w:after="0" w:afterAutospacing="1"/>
-        <w:ind w:left="1140" w:leftChars="0" w:hanging="360"/>
-      </w:pPr>
-      <w:bookmarkStart w:id="0" w:name="_GoBack"/>
-      <w:r>
-        <w:rPr>
-          <w:strike/>
-          <w:dstrike w:val="0"/>
-        </w:rPr>
-        <w:t xml:space="preserve">sandboxing </w:t>
-      </w:r>
-      <w:bookmarkEnd w:id="0"/>
-    </w:p>
-    <w:p>
-      <w:pPr>
-        <w:keepNext w:val="0"/>
-        <w:keepLines w:val="0"/>
-        <w:widowControl/>
-        <w:numPr>
-          <w:ilvl w:val="0"/>
-          <w:numId w:val="18"/>
-        </w:numPr>
-        <w:suppressLineNumbers w:val="0"/>
-        <w:tabs>
-          <w:tab w:val="left" w:pos="720"/>
-          <w:tab w:val="clear" w:pos="1140"/>
-        </w:tabs>
-        <w:spacing w:before="0" w:beforeAutospacing="1" w:after="0" w:afterAutospacing="1"/>
-        <w:ind w:left="1140" w:leftChars="0" w:hanging="360"/>
-      </w:pPr>
-      <w:r>
-        <w:t xml:space="preserve">permisos </w:t>
-      </w:r>
-    </w:p>
-    <w:p>
-      <w:pPr>
-        <w:keepNext w:val="0"/>
-        <w:keepLines w:val="0"/>
-        <w:widowControl/>
-        <w:numPr>
-          <w:ilvl w:val="0"/>
-          <w:numId w:val="18"/>
-        </w:numPr>
-        <w:suppressLineNumbers w:val="0"/>
-        <w:tabs>
-          <w:tab w:val="left" w:pos="720"/>
-          <w:tab w:val="clear" w:pos="1140"/>
-        </w:tabs>
-        <w:spacing w:before="0" w:beforeAutospacing="1" w:after="0" w:afterAutospacing="1"/>
-        <w:ind w:left="1140" w:leftChars="0" w:hanging="360"/>
-      </w:pPr>
-      <w:r>
-        <w:t xml:space="preserve">Docker </w:t>
-      </w:r>
-    </w:p>
-    <w:p>
-      <w:pPr>
-        <w:keepNext w:val="0"/>
-        <w:keepLines w:val="0"/>
-        <w:widowControl/>
-        <w:numPr>
-          <w:ilvl w:val="0"/>
-          <w:numId w:val="18"/>
-        </w:numPr>
-        <w:suppressLineNumbers w:val="0"/>
-        <w:tabs>
-          <w:tab w:val="left" w:pos="720"/>
-          <w:tab w:val="clear" w:pos="1140"/>
-        </w:tabs>
-        <w:spacing w:before="0" w:beforeAutospacing="1" w:after="0" w:afterAutospacing="1"/>
-        <w:ind w:left="1140" w:leftChars="0" w:hanging="360"/>
-      </w:pPr>
-      <w:r>
-        <w:t xml:space="preserve">testing </w:t>
-      </w:r>
-    </w:p>
-    <w:p>
-      <w:pPr>
-        <w:keepNext w:val="0"/>
-        <w:keepLines w:val="0"/>
-        <w:widowControl/>
-        <w:numPr>
-          <w:ilvl w:val="0"/>
-          <w:numId w:val="18"/>
-        </w:numPr>
-        <w:suppressLineNumbers w:val="0"/>
-        <w:tabs>
-          <w:tab w:val="left" w:pos="720"/>
-          <w:tab w:val="clear" w:pos="1140"/>
-        </w:tabs>
-        <w:spacing w:before="0" w:beforeAutospacing="1" w:after="0" w:afterAutospacing="1"/>
-        <w:ind w:left="1140" w:leftChars="0" w:hanging="360"/>
-      </w:pPr>
-      <w:r>
-        <w:t>packaging</w:t>
-      </w:r>
-    </w:p>
-    <w:p>
-      <w:pPr>
-        <w:keepNext w:val="0"/>
-        <w:keepLines w:val="0"/>
-        <w:widowControl/>
-        <w:numPr>
-          <w:numId w:val="0"/>
-        </w:numPr>
-        <w:suppressLineNumbers w:val="0"/>
-        <w:tabs>
-          <w:tab w:val="left" w:pos="720"/>
-        </w:tabs>
-        <w:spacing w:before="0" w:beforeAutospacing="1" w:after="0" w:afterAutospacing="1"/>
-        <w:ind w:left="360" w:leftChars="0"/>
-        <w:rPr>
-          <w:rFonts w:hint="default"/>
-          <w:lang w:val="en-US" w:eastAsia="zh-CN"/>
-        </w:rPr>
-      </w:pPr>
-    </w:p>
-    <w:p>
-      <w:pPr>
-        <w:keepNext w:val="0"/>
-        <w:keepLines w:val="0"/>
-        <w:widowControl/>
-        <w:numPr>
-          <w:numId w:val="0"/>
-        </w:numPr>
-        <w:suppressLineNumbers w:val="0"/>
-        <w:tabs>
-          <w:tab w:val="left" w:pos="720"/>
-        </w:tabs>
-        <w:spacing w:before="0" w:beforeAutospacing="1" w:after="0" w:afterAutospacing="1"/>
-        <w:ind w:left="360" w:leftChars="0"/>
-        <w:rPr>
-          <w:rFonts w:hint="default"/>
-          <w:lang w:val="en-US" w:eastAsia="zh-CN"/>
-        </w:rPr>
-      </w:pPr>
-    </w:p>
-    <w:p>
-      <w:pPr>
-        <w:keepNext w:val="0"/>
-        <w:keepLines w:val="0"/>
-        <w:widowControl/>
-        <w:numPr>
-          <w:numId w:val="0"/>
-        </w:numPr>
-        <w:suppressLineNumbers w:val="0"/>
-        <w:tabs>
-          <w:tab w:val="left" w:pos="720"/>
-        </w:tabs>
-        <w:spacing w:before="0" w:beforeAutospacing="1" w:after="0" w:afterAutospacing="1"/>
-        <w:ind w:left="360" w:leftChars="0"/>
-        <w:rPr>
-          <w:rFonts w:hint="default"/>
-          <w:lang w:val="en-US" w:eastAsia="zh-CN"/>
-        </w:rPr>
-      </w:pPr>
-    </w:p>
-    <w:p>
-      <w:pPr>
-        <w:keepNext w:val="0"/>
-        <w:keepLines w:val="0"/>
-        <w:widowControl/>
-        <w:numPr>
-          <w:numId w:val="0"/>
-        </w:numPr>
-        <w:suppressLineNumbers w:val="0"/>
-        <w:tabs>
-          <w:tab w:val="left" w:pos="720"/>
-        </w:tabs>
-        <w:spacing w:before="0" w:beforeAutospacing="1" w:after="0" w:afterAutospacing="1"/>
-        <w:ind w:left="360" w:leftChars="0"/>
-        <w:rPr>
-          <w:rFonts w:hint="default"/>
-          <w:lang w:val="en-US" w:eastAsia="zh-CN"/>
-        </w:rPr>
-      </w:pPr>
-    </w:p>
-    <w:p>
-      <w:pPr>
-        <w:keepNext w:val="0"/>
-        <w:keepLines w:val="0"/>
-        <w:widowControl/>
-        <w:numPr>
-          <w:numId w:val="0"/>
-        </w:numPr>
-        <w:suppressLineNumbers w:val="0"/>
-        <w:tabs>
-          <w:tab w:val="left" w:pos="720"/>
-        </w:tabs>
-        <w:spacing w:before="0" w:beforeAutospacing="1" w:after="0" w:afterAutospacing="1"/>
-        <w:ind w:left="360" w:leftChars="0"/>
-        <w:rPr>
-          <w:rFonts w:hint="default"/>
-          <w:lang w:val="en-US" w:eastAsia="zh-CN"/>
-        </w:rPr>
-      </w:pPr>
-    </w:p>
-    <w:p>
-      <w:pPr>
-        <w:keepNext w:val="0"/>
-        <w:keepLines w:val="0"/>
-        <w:widowControl/>
-        <w:numPr>
-          <w:numId w:val="0"/>
-        </w:numPr>
-        <w:suppressLineNumbers w:val="0"/>
-        <w:tabs>
-          <w:tab w:val="left" w:pos="720"/>
-        </w:tabs>
-        <w:spacing w:before="0" w:beforeAutospacing="1" w:after="0" w:afterAutospacing="1"/>
-        <w:ind w:left="360" w:leftChars="0"/>
-        <w:rPr>
-          <w:rFonts w:hint="default"/>
-          <w:lang w:val="en-US" w:eastAsia="zh-CN"/>
-        </w:rPr>
-      </w:pPr>
-    </w:p>
-    <w:p>
-      <w:pPr>
-        <w:keepNext w:val="0"/>
-        <w:keepLines w:val="0"/>
-        <w:widowControl/>
-        <w:numPr>
-          <w:numId w:val="0"/>
-        </w:numPr>
-        <w:suppressLineNumbers w:val="0"/>
-        <w:tabs>
-          <w:tab w:val="left" w:pos="720"/>
-        </w:tabs>
-        <w:spacing w:before="0" w:beforeAutospacing="1" w:after="0" w:afterAutospacing="1"/>
-        <w:ind w:left="360" w:leftChars="0"/>
-        <w:rPr>
-          <w:rFonts w:hint="default"/>
-          <w:lang w:val="en-US" w:eastAsia="zh-CN"/>
-        </w:rPr>
-      </w:pPr>
-    </w:p>
-    <w:p>
-      <w:pPr>
-        <w:keepNext w:val="0"/>
-        <w:keepLines w:val="0"/>
-        <w:widowControl/>
-        <w:numPr>
-          <w:numId w:val="0"/>
-        </w:numPr>
-        <w:suppressLineNumbers w:val="0"/>
-        <w:tabs>
-          <w:tab w:val="left" w:pos="720"/>
-        </w:tabs>
-        <w:spacing w:before="0" w:beforeAutospacing="1" w:after="0" w:afterAutospacing="1"/>
-        <w:ind w:left="360" w:leftChars="0"/>
-        <w:jc w:val="center"/>
+      </w:pPr>
+      <w:r>
         <w:rPr>
           <w:rFonts w:ascii="SimSun" w:hAnsi="SimSun" w:eastAsia="SimSun" w:cs="SimSun"/>
           <w:sz w:val="24"/>
           <w:szCs w:val="24"/>
         </w:rPr>
-      </w:pPr>
-      <w:r>
-        <w:rPr>
-          <w:rFonts w:ascii="SimSun" w:hAnsi="SimSun" w:eastAsia="SimSun" w:cs="SimSun"/>
-          <w:sz w:val="24"/>
-          <w:szCs w:val="24"/>
-        </w:rPr>
         <w:t>Librerías</w:t>
       </w:r>
     </w:p>
@@ -3156,6 +3168,7 @@
         <w:keepLines w:val="0"/>
         <w:widowControl/>
         <w:numPr>
+          <w:ilvl w:val="0"/>
           <w:numId w:val="0"/>
         </w:numPr>
         <w:suppressLineNumbers w:val="0"/>
@@ -3203,6 +3216,7 @@
         <w:keepLines w:val="0"/>
         <w:widowControl/>
         <w:numPr>
+          <w:ilvl w:val="0"/>
           <w:numId w:val="0"/>
         </w:numPr>
         <w:suppressLineNumbers w:val="0"/>
@@ -3402,6 +3416,7 @@
         <w:keepLines w:val="0"/>
         <w:widowControl/>
         <w:numPr>
+          <w:ilvl w:val="0"/>
           <w:numId w:val="0"/>
         </w:numPr>
         <w:suppressLineNumbers w:val="0"/>
@@ -3530,6 +3545,7 @@
         <w:keepLines w:val="0"/>
         <w:widowControl/>
         <w:numPr>
+          <w:ilvl w:val="0"/>
           <w:numId w:val="0"/>
         </w:numPr>
         <w:suppressLineNumbers w:val="0"/>
@@ -3628,6 +3644,7 @@
         <w:keepLines w:val="0"/>
         <w:widowControl/>
         <w:numPr>
+          <w:ilvl w:val="0"/>
           <w:numId w:val="0"/>
         </w:numPr>
         <w:suppressLineNumbers w:val="0"/>
@@ -3759,6 +3776,7 @@
         <w:keepLines w:val="0"/>
         <w:widowControl/>
         <w:numPr>
+          <w:ilvl w:val="0"/>
           <w:numId w:val="0"/>
         </w:numPr>
         <w:suppressLineNumbers w:val="0"/>
@@ -3781,6 +3799,7 @@
         <w:keepLines w:val="0"/>
         <w:widowControl/>
         <w:numPr>
+          <w:ilvl w:val="0"/>
           <w:numId w:val="0"/>
         </w:numPr>
         <w:suppressLineNumbers w:val="0"/>
@@ -3803,6 +3822,7 @@
         <w:keepLines w:val="0"/>
         <w:widowControl/>
         <w:numPr>
+          <w:ilvl w:val="0"/>
           <w:numId w:val="0"/>
         </w:numPr>
         <w:suppressLineNumbers w:val="0"/>
@@ -3825,6 +3845,7 @@
         <w:keepLines w:val="0"/>
         <w:widowControl/>
         <w:numPr>
+          <w:ilvl w:val="0"/>
           <w:numId w:val="0"/>
         </w:numPr>
         <w:suppressLineNumbers w:val="0"/>
@@ -3847,6 +3868,7 @@
         <w:keepLines w:val="0"/>
         <w:widowControl/>
         <w:numPr>
+          <w:ilvl w:val="0"/>
           <w:numId w:val="0"/>
         </w:numPr>
         <w:suppressLineNumbers w:val="0"/>
@@ -3869,6 +3891,7 @@
         <w:keepLines w:val="0"/>
         <w:widowControl/>
         <w:numPr>
+          <w:ilvl w:val="0"/>
           <w:numId w:val="0"/>
         </w:numPr>
         <w:suppressLineNumbers w:val="0"/>
@@ -3891,6 +3914,7 @@
         <w:keepLines w:val="0"/>
         <w:widowControl/>
         <w:numPr>
+          <w:ilvl w:val="0"/>
           <w:numId w:val="0"/>
         </w:numPr>
         <w:suppressLineNumbers w:val="0"/>
@@ -3939,6 +3963,7 @@
     </w:p>
     <w:tbl>
       <w:tblPr>
+        <w:tblStyle w:val="6"/>
         <w:tblW w:w="0" w:type="auto"/>
         <w:tblCellSpacing w:w="15" w:type="dxa"/>
         <w:tblInd w:w="0" w:type="dxa"/>
@@ -3950,7 +3975,7 @@
           <w:insideH w:val="none" w:color="auto" w:sz="0" w:space="0"/>
           <w:insideV w:val="none" w:color="auto" w:sz="0" w:space="0"/>
         </w:tblBorders>
-        <w:shd w:val="clear"/>
+        <w:shd w:val="clear" w:color="auto" w:fill="auto"/>
         <w:tblLayout w:type="autofit"/>
         <w:tblCellMar>
           <w:top w:w="15" w:type="dxa"/>
@@ -3973,6 +3998,13 @@
             <w:insideH w:val="none" w:color="auto" w:sz="0" w:space="0"/>
             <w:insideV w:val="none" w:color="auto" w:sz="0" w:space="0"/>
           </w:tblBorders>
+          <w:shd w:val="clear" w:color="auto" w:fill="auto"/>
+          <w:tblCellMar>
+            <w:top w:w="15" w:type="dxa"/>
+            <w:left w:w="15" w:type="dxa"/>
+            <w:bottom w:w="15" w:type="dxa"/>
+            <w:right w:w="15" w:type="dxa"/>
+          </w:tblCellMar>
         </w:tblPrEx>
         <w:trPr>
           <w:tblHeader/>
@@ -3981,7 +4013,7 @@
         <w:tc>
           <w:tcPr>
             <w:tcW w:w="0" w:type="auto"/>
-            <w:shd w:val="clear"/>
+            <w:shd w:val="clear" w:color="auto" w:fill="auto"/>
             <w:vAlign w:val="center"/>
           </w:tcPr>
           <w:p>
@@ -4013,7 +4045,7 @@
         <w:tc>
           <w:tcPr>
             <w:tcW w:w="3894" w:type="dxa"/>
-            <w:shd w:val="clear"/>
+            <w:shd w:val="clear" w:color="auto" w:fill="auto"/>
             <w:vAlign w:val="center"/>
           </w:tcPr>
           <w:p>
@@ -4053,6 +4085,7 @@
             <w:insideH w:val="none" w:color="auto" w:sz="0" w:space="0"/>
             <w:insideV w:val="none" w:color="auto" w:sz="0" w:space="0"/>
           </w:tblBorders>
+          <w:shd w:val="clear" w:color="auto" w:fill="auto"/>
           <w:tblCellMar>
             <w:top w:w="15" w:type="dxa"/>
             <w:left w:w="15" w:type="dxa"/>
@@ -4067,7 +4100,7 @@
         <w:tc>
           <w:tcPr>
             <w:tcW w:w="0" w:type="auto"/>
-            <w:shd w:val="clear"/>
+            <w:shd w:val="clear" w:color="auto" w:fill="auto"/>
             <w:vAlign w:val="center"/>
           </w:tcPr>
           <w:p>
@@ -4093,7 +4126,7 @@
         <w:tc>
           <w:tcPr>
             <w:tcW w:w="3894" w:type="dxa"/>
-            <w:shd w:val="clear"/>
+            <w:shd w:val="clear" w:color="auto" w:fill="auto"/>
             <w:vAlign w:val="center"/>
           </w:tcPr>
           <w:p>
@@ -4127,6 +4160,7 @@
             <w:insideH w:val="none" w:color="auto" w:sz="0" w:space="0"/>
             <w:insideV w:val="none" w:color="auto" w:sz="0" w:space="0"/>
           </w:tblBorders>
+          <w:shd w:val="clear" w:color="auto" w:fill="auto"/>
           <w:tblCellMar>
             <w:top w:w="15" w:type="dxa"/>
             <w:left w:w="15" w:type="dxa"/>
@@ -4140,7 +4174,7 @@
         <w:tc>
           <w:tcPr>
             <w:tcW w:w="0" w:type="auto"/>
-            <w:shd w:val="clear"/>
+            <w:shd w:val="clear" w:color="auto" w:fill="auto"/>
             <w:vAlign w:val="center"/>
           </w:tcPr>
           <w:p>
@@ -4166,7 +4200,7 @@
         <w:tc>
           <w:tcPr>
             <w:tcW w:w="3894" w:type="dxa"/>
-            <w:shd w:val="clear"/>
+            <w:shd w:val="clear" w:color="auto" w:fill="auto"/>
             <w:vAlign w:val="center"/>
           </w:tcPr>
           <w:p>
@@ -4200,6 +4234,7 @@
             <w:insideH w:val="none" w:color="auto" w:sz="0" w:space="0"/>
             <w:insideV w:val="none" w:color="auto" w:sz="0" w:space="0"/>
           </w:tblBorders>
+          <w:shd w:val="clear" w:color="auto" w:fill="auto"/>
           <w:tblCellMar>
             <w:top w:w="15" w:type="dxa"/>
             <w:left w:w="15" w:type="dxa"/>
@@ -4213,7 +4248,7 @@
         <w:tc>
           <w:tcPr>
             <w:tcW w:w="0" w:type="auto"/>
-            <w:shd w:val="clear"/>
+            <w:shd w:val="clear" w:color="auto" w:fill="auto"/>
             <w:vAlign w:val="center"/>
           </w:tcPr>
           <w:p>
@@ -4239,7 +4274,7 @@
         <w:tc>
           <w:tcPr>
             <w:tcW w:w="3894" w:type="dxa"/>
-            <w:shd w:val="clear"/>
+            <w:shd w:val="clear" w:color="auto" w:fill="auto"/>
             <w:vAlign w:val="center"/>
           </w:tcPr>
           <w:p>
@@ -4273,6 +4308,7 @@
             <w:insideH w:val="none" w:color="auto" w:sz="0" w:space="0"/>
             <w:insideV w:val="none" w:color="auto" w:sz="0" w:space="0"/>
           </w:tblBorders>
+          <w:shd w:val="clear" w:color="auto" w:fill="auto"/>
           <w:tblCellMar>
             <w:top w:w="15" w:type="dxa"/>
             <w:left w:w="15" w:type="dxa"/>
@@ -4286,7 +4322,7 @@
         <w:tc>
           <w:tcPr>
             <w:tcW w:w="0" w:type="auto"/>
-            <w:shd w:val="clear"/>
+            <w:shd w:val="clear" w:color="auto" w:fill="auto"/>
             <w:vAlign w:val="center"/>
           </w:tcPr>
           <w:p>
@@ -4312,7 +4348,7 @@
         <w:tc>
           <w:tcPr>
             <w:tcW w:w="3894" w:type="dxa"/>
-            <w:shd w:val="clear"/>
+            <w:shd w:val="clear" w:color="auto" w:fill="auto"/>
             <w:vAlign w:val="center"/>
           </w:tcPr>
           <w:p>
@@ -4346,7 +4382,7 @@
             <w:insideH w:val="none" w:color="auto" w:sz="0" w:space="0"/>
             <w:insideV w:val="none" w:color="auto" w:sz="0" w:space="0"/>
           </w:tblBorders>
-          <w:shd w:val="clear"/>
+          <w:shd w:val="clear" w:color="auto" w:fill="auto"/>
           <w:tblCellMar>
             <w:top w:w="15" w:type="dxa"/>
             <w:left w:w="15" w:type="dxa"/>
@@ -4360,7 +4396,7 @@
         <w:tc>
           <w:tcPr>
             <w:tcW w:w="0" w:type="auto"/>
-            <w:shd w:val="clear"/>
+            <w:shd w:val="clear" w:color="auto" w:fill="auto"/>
             <w:vAlign w:val="center"/>
           </w:tcPr>
           <w:p>
@@ -4386,7 +4422,7 @@
         <w:tc>
           <w:tcPr>
             <w:tcW w:w="3894" w:type="dxa"/>
-            <w:shd w:val="clear"/>
+            <w:shd w:val="clear" w:color="auto" w:fill="auto"/>
             <w:vAlign w:val="center"/>
           </w:tcPr>
           <w:p>
@@ -4433,7 +4469,7 @@
         <w:tc>
           <w:tcPr>
             <w:tcW w:w="0" w:type="auto"/>
-            <w:shd w:val="clear"/>
+            <w:shd w:val="clear" w:color="auto" w:fill="auto"/>
             <w:vAlign w:val="center"/>
           </w:tcPr>
           <w:p>
@@ -4459,7 +4495,7 @@
         <w:tc>
           <w:tcPr>
             <w:tcW w:w="3894" w:type="dxa"/>
-            <w:shd w:val="clear"/>
+            <w:shd w:val="clear" w:color="auto" w:fill="auto"/>
             <w:vAlign w:val="center"/>
           </w:tcPr>
           <w:p>
@@ -4493,7 +4529,7 @@
             <w:insideH w:val="none" w:color="auto" w:sz="0" w:space="0"/>
             <w:insideV w:val="none" w:color="auto" w:sz="0" w:space="0"/>
           </w:tblBorders>
-          <w:shd w:val="clear"/>
+          <w:shd w:val="clear" w:color="auto" w:fill="auto"/>
           <w:tblCellMar>
             <w:top w:w="15" w:type="dxa"/>
             <w:left w:w="15" w:type="dxa"/>
@@ -4507,7 +4543,7 @@
         <w:tc>
           <w:tcPr>
             <w:tcW w:w="0" w:type="auto"/>
-            <w:shd w:val="clear"/>
+            <w:shd w:val="clear" w:color="auto" w:fill="auto"/>
             <w:vAlign w:val="center"/>
           </w:tcPr>
           <w:p>
@@ -4533,7 +4569,7 @@
         <w:tc>
           <w:tcPr>
             <w:tcW w:w="3894" w:type="dxa"/>
-            <w:shd w:val="clear"/>
+            <w:shd w:val="clear" w:color="auto" w:fill="auto"/>
             <w:vAlign w:val="center"/>
           </w:tcPr>
           <w:p>
@@ -4567,6 +4603,7 @@
             <w:insideH w:val="none" w:color="auto" w:sz="0" w:space="0"/>
             <w:insideV w:val="none" w:color="auto" w:sz="0" w:space="0"/>
           </w:tblBorders>
+          <w:shd w:val="clear" w:color="auto" w:fill="auto"/>
           <w:tblCellMar>
             <w:top w:w="15" w:type="dxa"/>
             <w:left w:w="15" w:type="dxa"/>
@@ -4580,7 +4617,7 @@
         <w:tc>
           <w:tcPr>
             <w:tcW w:w="0" w:type="auto"/>
-            <w:shd w:val="clear"/>
+            <w:shd w:val="clear" w:color="auto" w:fill="auto"/>
             <w:vAlign w:val="center"/>
           </w:tcPr>
           <w:p>
@@ -4606,7 +4643,7 @@
         <w:tc>
           <w:tcPr>
             <w:tcW w:w="3894" w:type="dxa"/>
-            <w:shd w:val="clear"/>
+            <w:shd w:val="clear" w:color="auto" w:fill="auto"/>
             <w:vAlign w:val="center"/>
           </w:tcPr>
           <w:p>
@@ -4637,6 +4674,7 @@
         <w:keepLines w:val="0"/>
         <w:widowControl/>
         <w:numPr>
+          <w:ilvl w:val="0"/>
           <w:numId w:val="0"/>
         </w:numPr>
         <w:suppressLineNumbers w:val="0"/>
@@ -7535,6 +7573,7 @@
       <w:jc w:val="left"/>
     </w:pPr>
     <w:rPr>
+      <w:rFonts w:ascii="Times New Roman" w:hAnsi="Times New Roman" w:eastAsia="SimSun" w:cs="Times New Roman"/>
       <w:kern w:val="0"/>
       <w:sz w:val="24"/>
       <w:szCs w:val="24"/>

</xml_diff>

<commit_message>
build; get out docx
</commit_message>
<xml_diff>
--- a/guiaDoc/gia.docx
+++ b/guiaDoc/gia.docx
@@ -947,72 +947,55 @@
         <w:suppressLineNumbers w:val="0"/>
         <w:spacing w:before="0" w:beforeAutospacing="1" w:after="0" w:afterAutospacing="1"/>
         <w:ind w:left="1440" w:leftChars="0" w:hanging="360"/>
-      </w:pPr>
-      <w:r>
-        <w:t xml:space="preserve">resources </w:t>
-      </w:r>
-    </w:p>
-    <w:p>
-      <w:pPr>
-        <w:keepNext w:val="0"/>
-        <w:keepLines w:val="0"/>
-        <w:widowControl/>
-        <w:numPr>
-          <w:ilvl w:val="0"/>
-          <w:numId w:val="6"/>
-        </w:numPr>
-        <w:suppressLineNumbers w:val="0"/>
-        <w:spacing w:before="0" w:beforeAutospacing="1" w:after="0" w:afterAutospacing="1"/>
-        <w:ind w:left="1440" w:leftChars="0" w:hanging="360"/>
-      </w:pPr>
-      <w:r>
-        <w:t xml:space="preserve">prompts </w:t>
-      </w:r>
-    </w:p>
-    <w:p>
-      <w:pPr>
-        <w:keepNext w:val="0"/>
-        <w:keepLines w:val="0"/>
-        <w:widowControl/>
-        <w:numPr>
-          <w:ilvl w:val="0"/>
-          <w:numId w:val="6"/>
-        </w:numPr>
-        <w:suppressLineNumbers w:val="0"/>
-        <w:spacing w:before="0" w:beforeAutospacing="1" w:after="0" w:afterAutospacing="1"/>
-        <w:ind w:left="1440" w:leftChars="0" w:hanging="360"/>
-      </w:pPr>
-      <w:r>
         <w:rPr>
           <w:strike/>
           <w:dstrike w:val="0"/>
         </w:rPr>
-        <w:t xml:space="preserve">lifecycle </w:t>
-      </w:r>
-    </w:p>
-    <w:p>
-      <w:pPr>
-        <w:keepNext w:val="0"/>
-        <w:keepLines w:val="0"/>
-        <w:widowControl/>
-        <w:numPr>
-          <w:ilvl w:val="0"/>
-          <w:numId w:val="6"/>
-        </w:numPr>
-        <w:suppressLineNumbers w:val="0"/>
-        <w:spacing w:before="0" w:beforeAutospacing="1" w:after="0" w:afterAutospacing="1"/>
-        <w:ind w:left="1440" w:leftChars="0" w:hanging="360"/>
+      </w:pPr>
+      <w:r>
         <w:rPr>
           <w:strike/>
           <w:dstrike w:val="0"/>
         </w:rPr>
+        <w:t xml:space="preserve">resources </w:t>
+      </w:r>
+    </w:p>
+    <w:p>
+      <w:pPr>
+        <w:keepNext w:val="0"/>
+        <w:keepLines w:val="0"/>
+        <w:widowControl/>
+        <w:numPr>
+          <w:ilvl w:val="0"/>
+          <w:numId w:val="6"/>
+        </w:numPr>
+        <w:suppressLineNumbers w:val="0"/>
+        <w:spacing w:before="0" w:beforeAutospacing="1" w:after="0" w:afterAutospacing="1"/>
+        <w:ind w:left="1440" w:leftChars="0" w:hanging="360"/>
+      </w:pPr>
+      <w:r>
+        <w:t xml:space="preserve">prompts </w:t>
+      </w:r>
+    </w:p>
+    <w:p>
+      <w:pPr>
+        <w:keepNext w:val="0"/>
+        <w:keepLines w:val="0"/>
+        <w:widowControl/>
+        <w:numPr>
+          <w:ilvl w:val="0"/>
+          <w:numId w:val="6"/>
+        </w:numPr>
+        <w:suppressLineNumbers w:val="0"/>
+        <w:spacing w:before="0" w:beforeAutospacing="1" w:after="0" w:afterAutospacing="1"/>
+        <w:ind w:left="1440" w:leftChars="0" w:hanging="360"/>
       </w:pPr>
       <w:r>
         <w:rPr>
           <w:strike/>
           <w:dstrike w:val="0"/>
         </w:rPr>
-        <w:t xml:space="preserve">initialization handshake </w:t>
+        <w:t xml:space="preserve">lifecycle </w:t>
       </w:r>
     </w:p>
     <w:p>
@@ -1027,29 +1010,58 @@
         <w:suppressLineNumbers w:val="0"/>
         <w:spacing w:before="0" w:beforeAutospacing="1" w:after="0" w:afterAutospacing="1"/>
         <w:ind w:left="1440" w:leftChars="0" w:hanging="360"/>
-      </w:pPr>
-      <w:r>
-        <w:t xml:space="preserve">schemas </w:t>
-      </w:r>
-    </w:p>
-    <w:p>
-      <w:pPr>
-        <w:keepNext w:val="0"/>
-        <w:keepLines w:val="0"/>
-        <w:widowControl/>
-        <w:numPr>
-          <w:ilvl w:val="0"/>
-          <w:numId w:val="6"/>
-        </w:numPr>
-        <w:suppressLineNumbers w:val="0"/>
-        <w:spacing w:before="0" w:beforeAutospacing="1" w:after="0" w:afterAutospacing="1"/>
-        <w:ind w:left="1440" w:leftChars="0" w:hanging="360"/>
-      </w:pPr>
-      <w:r>
         <w:rPr>
           <w:strike/>
           <w:dstrike w:val="0"/>
         </w:rPr>
+      </w:pPr>
+      <w:r>
+        <w:rPr>
+          <w:strike/>
+          <w:dstrike w:val="0"/>
+        </w:rPr>
+        <w:t xml:space="preserve">initialization handshake </w:t>
+      </w:r>
+    </w:p>
+    <w:p>
+      <w:pPr>
+        <w:keepNext w:val="0"/>
+        <w:keepLines w:val="0"/>
+        <w:widowControl/>
+        <w:numPr>
+          <w:ilvl w:val="0"/>
+          <w:numId w:val="6"/>
+        </w:numPr>
+        <w:suppressLineNumbers w:val="0"/>
+        <w:spacing w:before="0" w:beforeAutospacing="1" w:after="0" w:afterAutospacing="1"/>
+        <w:ind w:left="1440" w:leftChars="0" w:hanging="360"/>
+      </w:pPr>
+      <w:r>
+        <w:rPr>
+          <w:strike/>
+          <w:dstrike w:val="0"/>
+        </w:rPr>
+        <w:t xml:space="preserve">schemas </w:t>
+      </w:r>
+    </w:p>
+    <w:p>
+      <w:pPr>
+        <w:keepNext w:val="0"/>
+        <w:keepLines w:val="0"/>
+        <w:widowControl/>
+        <w:numPr>
+          <w:ilvl w:val="0"/>
+          <w:numId w:val="6"/>
+        </w:numPr>
+        <w:suppressLineNumbers w:val="0"/>
+        <w:spacing w:before="0" w:beforeAutospacing="1" w:after="0" w:afterAutospacing="1"/>
+        <w:ind w:left="1440" w:leftChars="0" w:hanging="360"/>
+      </w:pPr>
+      <w:r>
+        <w:rPr>
+          <w:strike/>
+          <w:dstrike w:val="0"/>
+        </w:rPr>
         <w:t>JSON-RPC 2.0</w:t>
       </w:r>
       <w:r>
@@ -1071,6 +1083,25 @@
       </w:pPr>
       <w:r>
         <w:t xml:space="preserve">transports </w:t>
+      </w:r>
+      <w:bookmarkStart w:id="0" w:name="_GoBack"/>
+      <w:bookmarkEnd w:id="0"/>
+    </w:p>
+    <w:p>
+      <w:pPr>
+        <w:keepNext w:val="0"/>
+        <w:keepLines w:val="0"/>
+        <w:widowControl/>
+        <w:numPr>
+          <w:ilvl w:val="0"/>
+          <w:numId w:val="6"/>
+        </w:numPr>
+        <w:suppressLineNumbers w:val="0"/>
+        <w:spacing w:before="0" w:beforeAutospacing="1" w:after="0" w:afterAutospacing="1"/>
+        <w:ind w:left="1440" w:leftChars="0" w:hanging="360"/>
+      </w:pPr>
+      <w:r>
+        <w:t>structured errors</w:t>
       </w:r>
     </w:p>
     <w:p>
@@ -1213,10 +1244,7 @@
         <w:ind w:left="2160" w:leftChars="0" w:hanging="360"/>
       </w:pPr>
       <w:r>
-        <w:t>Server</w:t>
-      </w:r>
-      <w:r>
-        <w:t xml:space="preserve"> </w:t>
+        <w:t xml:space="preserve">Server </w:t>
       </w:r>
     </w:p>
     <w:p>
@@ -1233,10 +1261,7 @@
         <w:ind w:left="2160" w:leftChars="0" w:hanging="360"/>
       </w:pPr>
       <w:r>
-        <w:t>ClientSession</w:t>
-      </w:r>
-      <w:r>
-        <w:t xml:space="preserve"> </w:t>
+        <w:t xml:space="preserve">ClientSession </w:t>
       </w:r>
     </w:p>
     <w:p>
@@ -1255,8 +1280,6 @@
       <w:r>
         <w:t xml:space="preserve">transports </w:t>
       </w:r>
-      <w:bookmarkStart w:id="0" w:name="_GoBack"/>
-      <w:bookmarkEnd w:id="0"/>
     </w:p>
     <w:p>
       <w:pPr>
@@ -4410,7 +4433,6 @@
             <w:insideH w:val="none" w:color="auto" w:sz="0" w:space="0"/>
             <w:insideV w:val="none" w:color="auto" w:sz="0" w:space="0"/>
           </w:tblBorders>
-          <w:shd w:val="clear" w:color="auto" w:fill="auto"/>
           <w:tblCellMar>
             <w:top w:w="15" w:type="dxa"/>
             <w:left w:w="15" w:type="dxa"/>
@@ -4484,7 +4506,6 @@
             <w:insideH w:val="none" w:color="auto" w:sz="0" w:space="0"/>
             <w:insideV w:val="none" w:color="auto" w:sz="0" w:space="0"/>
           </w:tblBorders>
-          <w:shd w:val="clear" w:color="auto" w:fill="auto"/>
           <w:tblCellMar>
             <w:top w:w="15" w:type="dxa"/>
             <w:left w:w="15" w:type="dxa"/>
@@ -4558,7 +4579,6 @@
             <w:insideH w:val="none" w:color="auto" w:sz="0" w:space="0"/>
             <w:insideV w:val="none" w:color="auto" w:sz="0" w:space="0"/>
           </w:tblBorders>
-          <w:shd w:val="clear" w:color="auto" w:fill="auto"/>
           <w:tblCellMar>
             <w:top w:w="15" w:type="dxa"/>
             <w:left w:w="15" w:type="dxa"/>

</xml_diff>